<commit_message>
Fix database design: bus routes, seats, bus type values and complex view
- route no longer points to a bus; each bus now has a route_id and every
  route matches the bus destination
- info_seat now stores bus_id, so each passenger's seat is on a bus
- Use 'NON AC' everywhere, same manager_id type in both tables
- Fixed hire dates instead of SYSDATE so query results do not change
- Complex view now uses a join and GROUP BY
- Update report, screenshots and README
</commit_message>
<xml_diff>
--- a/docs/Bus_Ticket_Counter_Management_System.docx
+++ b/docs/Bus_Ticket_Counter_Management_System.docx
@@ -4803,8 +4803,7 @@
           <w:sz w:val="24"/>
           <w:szCs w:val="24"/>
         </w:rPr>
-        <w:lastRenderedPageBreak/>
-        <w:t>seat_id, seat_type, passenger_id</w:t>
+        <w:t>seat_id, seat_type, passenger_id, bus_id</w:t>
       </w:r>
     </w:p>
     <w:p>
@@ -5390,7 +5389,7 @@
         <w:lastRenderedPageBreak/>
         <w:drawing>
           <wp:inline distT="0" distB="0" distL="0" distR="0" wp14:anchorId="75C08A80" wp14:editId="7DB2EAD0">
-            <wp:extent cx="6825343" cy="3559241"/>
+            <wp:extent cx="5412000" cy="2864400"/>
             <wp:effectExtent l="0" t="0" r="0" b="3175"/>
             <wp:docPr id="2038827789" name="Picture 4"/>
             <wp:cNvGraphicFramePr>
@@ -5421,7 +5420,7 @@
                   <pic:spPr bwMode="auto">
                     <a:xfrm>
                       <a:off x="0" y="0"/>
-                      <a:ext cx="6842554" cy="3568216"/>
+                      <a:ext cx="5412000" cy="2864400"/>
                     </a:xfrm>
                     <a:prstGeom prst="rect">
                       <a:avLst/>
@@ -5697,7 +5696,7 @@
         </w:rPr>
         <w:drawing>
           <wp:inline distT="0" distB="0" distL="0" distR="0" wp14:anchorId="5B4AEF70" wp14:editId="5980B0B2">
-            <wp:extent cx="6851567" cy="2786743"/>
+            <wp:extent cx="5108400" cy="2336400"/>
             <wp:effectExtent l="0" t="0" r="6985" b="0"/>
             <wp:docPr id="1019381124" name="Picture 9"/>
             <wp:cNvGraphicFramePr>
@@ -5728,7 +5727,7 @@
                   <pic:spPr bwMode="auto">
                     <a:xfrm>
                       <a:off x="0" y="0"/>
-                      <a:ext cx="6858905" cy="2789727"/>
+                      <a:ext cx="5108400" cy="2336400"/>
                     </a:xfrm>
                     <a:prstGeom prst="rect">
                       <a:avLst/>
@@ -5759,7 +5758,7 @@
         <w:lastRenderedPageBreak/>
         <w:drawing>
           <wp:inline distT="0" distB="0" distL="0" distR="0" wp14:anchorId="05A26478" wp14:editId="09870A18">
-            <wp:extent cx="6847114" cy="3785664"/>
+            <wp:extent cx="4824600" cy="3273600"/>
             <wp:effectExtent l="0" t="0" r="0" b="5715"/>
             <wp:docPr id="139531940" name="Picture 10"/>
             <wp:cNvGraphicFramePr>
@@ -5790,7 +5789,7 @@
                   <pic:spPr bwMode="auto">
                     <a:xfrm>
                       <a:off x="0" y="0"/>
-                      <a:ext cx="6859230" cy="3792363"/>
+                      <a:ext cx="4824600" cy="3273600"/>
                     </a:xfrm>
                     <a:prstGeom prst="rect">
                       <a:avLst/>
@@ -5820,7 +5819,7 @@
         </w:rPr>
         <w:drawing>
           <wp:inline distT="0" distB="0" distL="0" distR="0" wp14:anchorId="5A4F7D41" wp14:editId="5A7C3CBF">
-            <wp:extent cx="6839451" cy="2971800"/>
+            <wp:extent cx="4857600" cy="1834800"/>
             <wp:effectExtent l="0" t="0" r="0" b="0"/>
             <wp:docPr id="179387607" name="Picture 11"/>
             <wp:cNvGraphicFramePr>
@@ -5851,7 +5850,7 @@
                   <pic:spPr bwMode="auto">
                     <a:xfrm>
                       <a:off x="0" y="0"/>
-                      <a:ext cx="6853059" cy="2977713"/>
+                      <a:ext cx="4857600" cy="1834800"/>
                     </a:xfrm>
                     <a:prstGeom prst="rect">
                       <a:avLst/>
@@ -6536,7 +6535,7 @@
         </w:rPr>
         <w:drawing>
           <wp:inline distT="0" distB="0" distL="0" distR="0" wp14:anchorId="1AF492CF" wp14:editId="459DE018">
-            <wp:extent cx="7017824" cy="1422309"/>
+            <wp:extent cx="5207400" cy="2574000"/>
             <wp:effectExtent l="0" t="0" r="0" b="6985"/>
             <wp:docPr id="1657844516" name="Picture 1"/>
             <wp:cNvGraphicFramePr>
@@ -6558,7 +6557,7 @@
                   <pic:spPr>
                     <a:xfrm>
                       <a:off x="0" y="0"/>
-                      <a:ext cx="7033116" cy="1425408"/>
+                      <a:ext cx="5207400" cy="2574000"/>
                     </a:xfrm>
                     <a:prstGeom prst="rect">
                       <a:avLst/>
@@ -6579,7 +6578,7 @@
         <w:lastRenderedPageBreak/>
         <w:drawing>
           <wp:inline distT="0" distB="0" distL="0" distR="0" wp14:anchorId="43E58AE8" wp14:editId="58519660">
-            <wp:extent cx="6858000" cy="3550627"/>
+            <wp:extent cx="2369400" cy="3339600"/>
             <wp:effectExtent l="0" t="0" r="0" b="0"/>
             <wp:docPr id="1650258837" name="Picture 1"/>
             <wp:cNvGraphicFramePr>
@@ -6601,7 +6600,7 @@
                   <pic:spPr>
                     <a:xfrm>
                       <a:off x="0" y="0"/>
-                      <a:ext cx="6871582" cy="3557659"/>
+                      <a:ext cx="2369400" cy="3339600"/>
                     </a:xfrm>
                     <a:prstGeom prst="rect">
                       <a:avLst/>
@@ -6621,7 +6620,7 @@
         </w:rPr>
         <w:drawing>
           <wp:inline distT="0" distB="0" distL="0" distR="0" wp14:anchorId="4BB1DC78" wp14:editId="19F3F832">
-            <wp:extent cx="7107457" cy="1462496"/>
+            <wp:extent cx="7107457" cy="1781432"/>
             <wp:effectExtent l="0" t="0" r="0" b="4445"/>
             <wp:docPr id="1173874419" name="Picture 1"/>
             <wp:cNvGraphicFramePr>
@@ -6643,7 +6642,7 @@
                   <pic:spPr>
                     <a:xfrm>
                       <a:off x="0" y="0"/>
-                      <a:ext cx="7120926" cy="1465268"/>
+                      <a:ext cx="7107457" cy="1781432"/>
                     </a:xfrm>
                     <a:prstGeom prst="rect">
                       <a:avLst/>
@@ -6665,7 +6664,7 @@
         <w:lastRenderedPageBreak/>
         <w:drawing>
           <wp:inline distT="0" distB="0" distL="0" distR="0" wp14:anchorId="4CB6AB8E" wp14:editId="592C2103">
-            <wp:extent cx="5811520" cy="3023729"/>
+            <wp:extent cx="5101800" cy="3339600"/>
             <wp:effectExtent l="0" t="0" r="0" b="5715"/>
             <wp:docPr id="992414111" name="Picture 1"/>
             <wp:cNvGraphicFramePr>
@@ -6687,7 +6686,7 @@
                   <pic:spPr>
                     <a:xfrm>
                       <a:off x="0" y="0"/>
-                      <a:ext cx="5856111" cy="3046930"/>
+                      <a:ext cx="5101800" cy="3339600"/>
                     </a:xfrm>
                     <a:prstGeom prst="rect">
                       <a:avLst/>
@@ -6707,7 +6706,7 @@
         </w:rPr>
         <w:drawing>
           <wp:inline distT="0" distB="0" distL="0" distR="0" wp14:anchorId="68880731" wp14:editId="44E177B2">
-            <wp:extent cx="7163523" cy="1470206"/>
+            <wp:extent cx="4897200" cy="1386000"/>
             <wp:effectExtent l="0" t="0" r="0" b="0"/>
             <wp:docPr id="2010689093" name="Picture 1"/>
             <wp:cNvGraphicFramePr>
@@ -6729,7 +6728,7 @@
                   <pic:spPr>
                     <a:xfrm>
                       <a:off x="0" y="0"/>
-                      <a:ext cx="7180735" cy="1473738"/>
+                      <a:ext cx="4897200" cy="1386000"/>
                     </a:xfrm>
                     <a:prstGeom prst="rect">
                       <a:avLst/>
@@ -6749,7 +6748,7 @@
         </w:rPr>
         <w:drawing>
           <wp:inline distT="0" distB="0" distL="0" distR="0" wp14:anchorId="363E4367" wp14:editId="6B141E02">
-            <wp:extent cx="6675136" cy="3461657"/>
+            <wp:extent cx="2277000" cy="1887600"/>
             <wp:effectExtent l="0" t="0" r="0" b="5715"/>
             <wp:docPr id="271036538" name="Picture 1"/>
             <wp:cNvGraphicFramePr>
@@ -6771,7 +6770,7 @@
                   <pic:spPr>
                     <a:xfrm>
                       <a:off x="0" y="0"/>
-                      <a:ext cx="6712762" cy="3481170"/>
+                      <a:ext cx="2277000" cy="1887600"/>
                     </a:xfrm>
                     <a:prstGeom prst="rect">
                       <a:avLst/>
@@ -8507,46 +8506,46 @@
         <w:rPr>
           <w:rFonts w:ascii="Times New Roman" w:hAnsi="Times New Roman" w:cs="Times New Roman"/>
         </w:rPr>
-        <w:t>CREATE VIEW high_paid_managers AS</w:t>
-      </w:r>
-    </w:p>
-    <w:p>
-      <w:pPr>
-        <w:rPr>
-          <w:rFonts w:ascii="Times New Roman" w:hAnsi="Times New Roman" w:cs="Times New Roman"/>
-        </w:rPr>
-      </w:pPr>
-      <w:r>
-        <w:rPr>
-          <w:rFonts w:ascii="Times New Roman" w:hAnsi="Times New Roman" w:cs="Times New Roman"/>
-        </w:rPr>
-        <w:t>SELECT MANAGER_ID, MANAGER_NAME, MANAGER_SALARY</w:t>
-      </w:r>
-    </w:p>
-    <w:p>
-      <w:pPr>
-        <w:rPr>
-          <w:rFonts w:ascii="Times New Roman" w:hAnsi="Times New Roman" w:cs="Times New Roman"/>
-        </w:rPr>
-      </w:pPr>
-      <w:r>
-        <w:rPr>
-          <w:rFonts w:ascii="Times New Roman" w:hAnsi="Times New Roman" w:cs="Times New Roman"/>
-        </w:rPr>
-        <w:t>FROM manager</w:t>
-      </w:r>
-    </w:p>
-    <w:p>
-      <w:pPr>
-        <w:rPr>
-          <w:rFonts w:ascii="Times New Roman" w:hAnsi="Times New Roman" w:cs="Times New Roman"/>
-        </w:rPr>
-      </w:pPr>
-      <w:r>
-        <w:rPr>
-          <w:rFonts w:ascii="Times New Roman" w:hAnsi="Times New Roman" w:cs="Times New Roman"/>
-        </w:rPr>
-        <w:t>WHERE MANAGER_SALARY &gt; 20000;</w:t>
+        <w:t>CREATE VIEW manager_sales_view AS</w:t>
+      </w:r>
+    </w:p>
+    <w:p>
+      <w:pPr>
+        <w:rPr>
+          <w:rFonts w:ascii="Times New Roman" w:hAnsi="Times New Roman" w:cs="Times New Roman"/>
+        </w:rPr>
+      </w:pPr>
+      <w:r>
+        <w:rPr>
+          <w:rFonts w:ascii="Times New Roman" w:hAnsi="Times New Roman" w:cs="Times New Roman"/>
+        </w:rPr>
+        <w:t>SELECT m.MANAGER_ID, m.MANAGER_NAME, COUNT(ti.TICKET_ID) AS TICKETS_SOLD, SUM(ti.PRICE) AS TOTAL_SALES</w:t>
+      </w:r>
+    </w:p>
+    <w:p>
+      <w:pPr>
+        <w:rPr>
+          <w:rFonts w:ascii="Times New Roman" w:hAnsi="Times New Roman" w:cs="Times New Roman"/>
+        </w:rPr>
+      </w:pPr>
+      <w:r>
+        <w:rPr>
+          <w:rFonts w:ascii="Times New Roman" w:hAnsi="Times New Roman" w:cs="Times New Roman"/>
+        </w:rPr>
+        <w:t>FROM manager m, ticket_agent ta, ticket_info ti</w:t>
+      </w:r>
+    </w:p>
+    <w:p>
+      <w:pPr>
+        <w:rPr>
+          <w:rFonts w:ascii="Times New Roman" w:hAnsi="Times New Roman" w:cs="Times New Roman"/>
+        </w:rPr>
+      </w:pPr>
+      <w:r>
+        <w:rPr>
+          <w:rFonts w:ascii="Times New Roman" w:hAnsi="Times New Roman" w:cs="Times New Roman"/>
+        </w:rPr>
+        <w:t>WHERE m.MANAGER_ID = ta.MANAGER_ID AND ta.AGENT_ID = ti.AGENT_ID GROUP BY m.MANAGER_ID, m.MANAGER_NAME;</w:t>
       </w:r>
     </w:p>
     <w:p>
@@ -8576,7 +8575,7 @@
         <w:rPr>
           <w:rFonts w:ascii="Times New Roman" w:hAnsi="Times New Roman" w:cs="Times New Roman"/>
         </w:rPr>
-        <w:t>SELECT * FROM high_paid_managers;</w:t>
+        <w:t>SELECT * FROM manager_sales_view;</w:t>
       </w:r>
     </w:p>
     <w:p>
@@ -8591,7 +8590,7 @@
         </w:rPr>
         <w:drawing>
           <wp:inline distT="0" distB="0" distL="0" distR="0" wp14:anchorId="7C8D05F6" wp14:editId="344D3679">
-            <wp:extent cx="5943600" cy="1382395"/>
+            <wp:extent cx="2626800" cy="1386000"/>
             <wp:effectExtent l="0" t="0" r="0" b="8255"/>
             <wp:docPr id="2099700814" name="Picture 1"/>
             <wp:cNvGraphicFramePr>
@@ -8613,7 +8612,7 @@
                   <pic:spPr>
                     <a:xfrm>
                       <a:off x="0" y="0"/>
-                      <a:ext cx="5943600" cy="1382395"/>
+                      <a:ext cx="2626800" cy="1386000"/>
                     </a:xfrm>
                     <a:prstGeom prst="rect">
                       <a:avLst/>
@@ -8639,7 +8638,7 @@
         </w:rPr>
         <w:drawing>
           <wp:inline distT="0" distB="0" distL="0" distR="0" wp14:anchorId="0BDA76F7" wp14:editId="0C8FDFE3">
-            <wp:extent cx="5943600" cy="1604010"/>
+            <wp:extent cx="3148200" cy="1161600"/>
             <wp:effectExtent l="0" t="0" r="0" b="0"/>
             <wp:docPr id="1856680334" name="Picture 1"/>
             <wp:cNvGraphicFramePr>
@@ -8661,7 +8660,7 @@
                   <pic:spPr>
                     <a:xfrm>
                       <a:off x="0" y="0"/>
-                      <a:ext cx="5943600" cy="1604010"/>
+                      <a:ext cx="3148200" cy="1161600"/>
                     </a:xfrm>
                     <a:prstGeom prst="rect">
                       <a:avLst/>

</xml_diff>